<commit_message>
added examples (tic tac toe via serial, doom), added tic tac toe exercise
</commit_message>
<xml_diff>
--- a/docs/KComp_V2_SetupGuide.docx
+++ b/docs/KComp_V2_SetupGuide.docx
@@ -665,17 +665,8 @@
                 <w:rFonts w:ascii="Courier New" w:hAnsi="Courier New" w:cs="Courier New"/>
                 <w:lang w:val="en-US"/>
               </w:rPr>
-              <w:t xml:space="preserve">8 </w:t>
-            </w:r>
-            <w:proofErr w:type="gramStart"/>
-            <w:r>
-              <w:rPr>
-                <w:rFonts w:ascii="Courier New" w:hAnsi="Courier New" w:cs="Courier New"/>
-                <w:lang w:val="en-US"/>
-              </w:rPr>
-              <w:t>bit</w:t>
-            </w:r>
-            <w:proofErr w:type="gramEnd"/>
+              <w:t>8 bit</w:t>
+            </w:r>
           </w:p>
         </w:tc>
         <w:tc>
@@ -833,21 +824,7 @@
               <w:rPr>
                 <w:lang w:val="en-US"/>
               </w:rPr>
-              <w:t xml:space="preserve">Temporary memory </w:t>
-            </w:r>
-            <w:proofErr w:type="gramStart"/>
-            <w:r>
-              <w:rPr>
-                <w:lang w:val="en-US"/>
-              </w:rPr>
-              <w:t>used</w:t>
-            </w:r>
-            <w:proofErr w:type="gramEnd"/>
-            <w:r>
-              <w:rPr>
-                <w:lang w:val="en-US"/>
-              </w:rPr>
-              <w:t xml:space="preserve"> to store variables while the program is running.</w:t>
+              <w:t>Temporary memory used to store variables while the program is running.</w:t>
             </w:r>
           </w:p>
         </w:tc>
@@ -919,11 +896,9 @@
             <w:hideMark/>
           </w:tcPr>
           <w:p>
-            <w:proofErr w:type="gramStart"/>
             <w:r>
               <w:t>USB Interface</w:t>
             </w:r>
-            <w:proofErr w:type="gramEnd"/>
           </w:p>
         </w:tc>
         <w:tc>
@@ -1458,14 +1433,7 @@
               <w:rPr>
                 <w:lang w:val="en-US" w:eastAsia="de-DE"/>
               </w:rPr>
-              <w:t xml:space="preserve">It gets programmed via </w:t>
-            </w:r>
-            <w:proofErr w:type="gramStart"/>
-            <w:r>
-              <w:rPr>
-                <w:lang w:val="en-US" w:eastAsia="de-DE"/>
-              </w:rPr>
-              <w:t xml:space="preserve">the </w:t>
+              <w:t xml:space="preserve">It gets programmed via the </w:t>
             </w:r>
             <w:r>
               <w:rPr>
@@ -1474,7 +1442,6 @@
               </w:rPr>
               <w:t>MCP2221A</w:t>
             </w:r>
-            <w:proofErr w:type="gramEnd"/>
             <w:r>
               <w:rPr>
                 <w:lang w:val="en-US" w:eastAsia="de-DE"/>
@@ -1710,23 +1677,13 @@
               </w:rPr>
               <w:t xml:space="preserve"> </w:t>
             </w:r>
-            <w:proofErr w:type="spellStart"/>
             <w:r>
               <w:rPr>
                 <w:b/>
                 <w:bCs/>
                 <w:lang w:val="de-AT"/>
               </w:rPr>
-              <w:t>Red</w:t>
-            </w:r>
-            <w:proofErr w:type="spellEnd"/>
-            <w:r>
-              <w:rPr>
-                <w:b/>
-                <w:bCs/>
-                <w:lang w:val="de-AT"/>
-              </w:rPr>
-              <w:t xml:space="preserve"> LED</w:t>
+              <w:t>Red LED</w:t>
             </w:r>
           </w:p>
           <w:p>
@@ -1764,21 +1721,8 @@
                 <w:lang w:val="en-US"/>
               </w:rPr>
             </w:pPr>
-            <w:proofErr w:type="spellStart"/>
-            <w:r>
-              <w:t>Connected</w:t>
-            </w:r>
-            <w:proofErr w:type="spellEnd"/>
-            <w:r>
-              <w:t xml:space="preserve"> </w:t>
-            </w:r>
-            <w:proofErr w:type="spellStart"/>
-            <w:r>
-              <w:t>to</w:t>
-            </w:r>
-            <w:proofErr w:type="spellEnd"/>
-            <w:r>
-              <w:t xml:space="preserve"> </w:t>
+            <w:r>
+              <w:t xml:space="preserve">Connected to </w:t>
             </w:r>
             <w:r>
               <w:rPr>
@@ -2095,21 +2039,8 @@
                 <w:lang w:val="en-US"/>
               </w:rPr>
             </w:pPr>
-            <w:proofErr w:type="spellStart"/>
-            <w:r>
-              <w:t>Connected</w:t>
-            </w:r>
-            <w:proofErr w:type="spellEnd"/>
-            <w:r>
-              <w:t xml:space="preserve"> </w:t>
-            </w:r>
-            <w:proofErr w:type="spellStart"/>
-            <w:r>
-              <w:t>to</w:t>
-            </w:r>
-            <w:proofErr w:type="spellEnd"/>
-            <w:r>
-              <w:t xml:space="preserve"> </w:t>
+            <w:r>
+              <w:t xml:space="preserve">Connected to </w:t>
             </w:r>
             <w:r>
               <w:rPr>
@@ -2321,25 +2252,7 @@
                 <w:bCs/>
                 <w:lang w:val="en-US"/>
               </w:rPr>
-              <w:t xml:space="preserve">0.96" </w:t>
-            </w:r>
-            <w:proofErr w:type="gramStart"/>
-            <w:r>
-              <w:rPr>
-                <w:b/>
-                <w:bCs/>
-                <w:lang w:val="en-US"/>
-              </w:rPr>
-              <w:t>OLED Display</w:t>
-            </w:r>
-            <w:proofErr w:type="gramEnd"/>
-            <w:r>
-              <w:rPr>
-                <w:b/>
-                <w:bCs/>
-                <w:lang w:val="en-US"/>
-              </w:rPr>
-              <w:t xml:space="preserve"> (SSD1306, I²C)</w:t>
+              <w:t>0.96" OLED Display (SSD1306, I²C)</w:t>
             </w:r>
           </w:p>
           <w:p>
@@ -2364,16 +2277,8 @@
               <w:rPr>
                 <w:lang w:val="de-AT"/>
               </w:rPr>
-              <w:t xml:space="preserve"> </w:t>
-            </w:r>
-            <w:proofErr w:type="spellStart"/>
-            <w:r>
-              <w:rPr>
-                <w:lang w:val="de-AT"/>
-              </w:rPr>
-              <w:t>pixels</w:t>
-            </w:r>
-            <w:proofErr w:type="spellEnd"/>
+              <w:t xml:space="preserve"> pixels</w:t>
+            </w:r>
             <w:r>
               <w:rPr>
                 <w:lang w:val="de-AT"/>
@@ -2631,25 +2536,7 @@
                 <w:bCs/>
                 <w:lang w:val="en-US"/>
               </w:rPr>
-              <w:t xml:space="preserve">ESP-01 </w:t>
-            </w:r>
-            <w:proofErr w:type="spellStart"/>
-            <w:r>
-              <w:rPr>
-                <w:b/>
-                <w:bCs/>
-                <w:lang w:val="en-US"/>
-              </w:rPr>
-              <w:t>WiFi</w:t>
-            </w:r>
-            <w:proofErr w:type="spellEnd"/>
-            <w:r>
-              <w:rPr>
-                <w:b/>
-                <w:bCs/>
-                <w:lang w:val="en-US"/>
-              </w:rPr>
-              <w:t xml:space="preserve"> Header (Optional)</w:t>
+              <w:t>ESP-01 WiFi Header (Optional)</w:t>
             </w:r>
           </w:p>
           <w:p>
@@ -2663,21 +2550,11 @@
                 <w:lang w:val="en-US"/>
               </w:rPr>
             </w:pPr>
-            <w:proofErr w:type="spellStart"/>
-            <w:proofErr w:type="gramStart"/>
-            <w:r>
-              <w:rPr>
-                <w:lang w:val="en-US"/>
-              </w:rPr>
-              <w:t>Lets</w:t>
-            </w:r>
-            <w:proofErr w:type="spellEnd"/>
-            <w:proofErr w:type="gramEnd"/>
-            <w:r>
-              <w:rPr>
-                <w:lang w:val="en-US"/>
-              </w:rPr>
-              <w:t xml:space="preserve"> you add an </w:t>
+            <w:r>
+              <w:rPr>
+                <w:lang w:val="en-US"/>
+              </w:rPr>
+              <w:t xml:space="preserve">Lets you add an </w:t>
             </w:r>
             <w:r>
               <w:rPr>
@@ -2690,21 +2567,7 @@
               <w:rPr>
                 <w:lang w:val="en-US"/>
               </w:rPr>
-              <w:t xml:space="preserve"> </w:t>
-            </w:r>
-            <w:proofErr w:type="spellStart"/>
-            <w:r>
-              <w:rPr>
-                <w:lang w:val="en-US"/>
-              </w:rPr>
-              <w:t>WiFi</w:t>
-            </w:r>
-            <w:proofErr w:type="spellEnd"/>
-            <w:r>
-              <w:rPr>
-                <w:lang w:val="en-US"/>
-              </w:rPr>
-              <w:t xml:space="preserve"> module for wireless communication</w:t>
+              <w:t xml:space="preserve"> WiFi module for wireless communication</w:t>
             </w:r>
             <w:r>
               <w:rPr>
@@ -2750,7 +2613,6 @@
               </w:rPr>
               <w:t xml:space="preserve"> </w:t>
             </w:r>
-            <w:proofErr w:type="gramStart"/>
             <w:r>
               <w:rPr>
                 <w:rFonts w:ascii="Segoe UI Emoji" w:hAnsi="Segoe UI Emoji" w:cs="Segoe UI Emoji"/>
@@ -2758,17 +2620,7 @@
                 <w:bCs/>
                 <w:lang w:val="en-US"/>
               </w:rPr>
-              <w:t>Pin Headers</w:t>
-            </w:r>
-            <w:proofErr w:type="gramEnd"/>
-            <w:r>
-              <w:rPr>
-                <w:rFonts w:ascii="Segoe UI Emoji" w:hAnsi="Segoe UI Emoji" w:cs="Segoe UI Emoji"/>
-                <w:b/>
-                <w:bCs/>
-                <w:lang w:val="en-US"/>
-              </w:rPr>
-              <w:t xml:space="preserve"> and Jumpers</w:t>
+              <w:t>Pin Headers and Jumpers</w:t>
             </w:r>
           </w:p>
           <w:p>
@@ -2875,21 +2727,11 @@
                 <w:lang w:val="en-US"/>
               </w:rPr>
             </w:pPr>
-            <w:proofErr w:type="spellStart"/>
-            <w:proofErr w:type="gramStart"/>
-            <w:r>
-              <w:rPr>
-                <w:lang w:val="en-US"/>
-              </w:rPr>
-              <w:t>Lets</w:t>
-            </w:r>
-            <w:proofErr w:type="spellEnd"/>
-            <w:proofErr w:type="gramEnd"/>
-            <w:r>
-              <w:rPr>
-                <w:lang w:val="en-US"/>
-              </w:rPr>
-              <w:t xml:space="preserve"> you add an </w:t>
+            <w:r>
+              <w:rPr>
+                <w:lang w:val="en-US"/>
+              </w:rPr>
+              <w:t xml:space="preserve">Lets you add an </w:t>
             </w:r>
             <w:r>
               <w:rPr>
@@ -3018,9 +2860,17 @@
           <w:szCs w:val="32"/>
           <w:lang w:val="en-US"/>
         </w:rPr>
-        <w:t>Visual Studio Code (</w:t>
-      </w:r>
-      <w:proofErr w:type="spellStart"/>
+        <w:t>Visual Studio Code (PlatformIO)</w:t>
+      </w:r>
+      <w:r>
+        <w:rPr>
+          <w:kern w:val="32"/>
+          <w:sz w:val="24"/>
+          <w:szCs w:val="32"/>
+          <w:lang w:val="en-US"/>
+        </w:rPr>
+        <w:t xml:space="preserve"> and </w:t>
+      </w:r>
       <w:r>
         <w:rPr>
           <w:b/>
@@ -3030,52 +2880,7 @@
           <w:szCs w:val="32"/>
           <w:lang w:val="en-US"/>
         </w:rPr>
-        <w:t>PlatformIO</w:t>
-      </w:r>
-      <w:proofErr w:type="spellEnd"/>
-      <w:r>
-        <w:rPr>
-          <w:b/>
-          <w:bCs/>
-          <w:kern w:val="32"/>
-          <w:sz w:val="24"/>
-          <w:szCs w:val="32"/>
-          <w:lang w:val="en-US"/>
-        </w:rPr>
-        <w:t>)</w:t>
-      </w:r>
-      <w:r>
-        <w:rPr>
-          <w:kern w:val="32"/>
-          <w:sz w:val="24"/>
-          <w:szCs w:val="32"/>
-          <w:lang w:val="en-US"/>
-        </w:rPr>
-        <w:t xml:space="preserve"> and </w:t>
-      </w:r>
-      <w:proofErr w:type="spellStart"/>
-      <w:r>
-        <w:rPr>
-          <w:b/>
-          <w:bCs/>
-          <w:kern w:val="32"/>
-          <w:sz w:val="24"/>
-          <w:szCs w:val="32"/>
-          <w:lang w:val="en-US"/>
-        </w:rPr>
-        <w:t>MBlock</w:t>
-      </w:r>
-      <w:proofErr w:type="spellEnd"/>
-      <w:r>
-        <w:rPr>
-          <w:b/>
-          <w:bCs/>
-          <w:kern w:val="32"/>
-          <w:sz w:val="24"/>
-          <w:szCs w:val="32"/>
-          <w:lang w:val="en-US"/>
-        </w:rPr>
-        <w:t xml:space="preserve"> 5</w:t>
+        <w:t>MBlock 5</w:t>
       </w:r>
       <w:r>
         <w:rPr>
@@ -3355,19 +3160,13 @@
         <w:r>
           <w:rPr>
             <w:rStyle w:val="Hyperlink"/>
-            <w:kern w:val="32"/>
-            <w:sz w:val="24"/>
-            <w:szCs w:val="32"/>
             <w:lang w:val="en-US"/>
           </w:rPr>
-          <w:t>https://raw.githubusercontent.com/andkuc/k-comp/refs/heads/main/kcompV1_1_0_0_package_index.json</w:t>
+          <w:t>https://raw.githubusercontent.com/andkuc/k-comp/refs/heads/main/board-definition/kcompV2/kcompV2_1_0_0_package_index.json</w:t>
         </w:r>
       </w:hyperlink>
       <w:r>
         <w:rPr>
-          <w:kern w:val="32"/>
-          <w:sz w:val="24"/>
-          <w:szCs w:val="32"/>
           <w:lang w:val="en-US"/>
         </w:rPr>
         <w:t xml:space="preserve"> </w:t>
@@ -3465,25 +3264,7 @@
           <w:bCs w:val="0"/>
           <w:lang w:val="en-US"/>
         </w:rPr>
-        <w:t xml:space="preserve"> Do not forget to install </w:t>
-      </w:r>
-      <w:proofErr w:type="gramStart"/>
-      <w:r>
-        <w:rPr>
-          <w:b w:val="0"/>
-          <w:bCs w:val="0"/>
-          <w:lang w:val="en-US"/>
-        </w:rPr>
-        <w:t>the driver for</w:t>
-      </w:r>
-      <w:proofErr w:type="gramEnd"/>
-      <w:r>
-        <w:rPr>
-          <w:b w:val="0"/>
-          <w:bCs w:val="0"/>
-          <w:lang w:val="en-US"/>
-        </w:rPr>
-        <w:t xml:space="preserve"> MCP2221A!</w:t>
+        <w:t xml:space="preserve"> Do not forget to install the driver for MCP2221A!</w:t>
       </w:r>
     </w:p>
     <w:p>
@@ -3743,19 +3524,11 @@
           <w:lang w:val="en-US"/>
         </w:rPr>
       </w:pPr>
-      <w:proofErr w:type="gramStart"/>
-      <w:r>
-        <w:rPr>
-          <w:lang w:val="en-US"/>
-        </w:rPr>
-        <w:t>In order to</w:t>
-      </w:r>
-      <w:proofErr w:type="gramEnd"/>
-      <w:r>
-        <w:rPr>
-          <w:lang w:val="en-US"/>
-        </w:rPr>
-        <w:t xml:space="preserve"> upload the sample programs, you select </w:t>
+      <w:r>
+        <w:rPr>
+          <w:lang w:val="en-US"/>
+        </w:rPr>
+        <w:t xml:space="preserve">In order to upload the sample programs, you select </w:t>
       </w:r>
       <w:r>
         <w:rPr>
@@ -3853,7 +3626,6 @@
         </w:rPr>
         <w:t xml:space="preserve"> </w:t>
       </w:r>
-      <w:proofErr w:type="spellStart"/>
       <w:r>
         <w:rPr>
           <w:rFonts w:ascii="Courier New" w:hAnsi="Courier New" w:cs="Courier New"/>
@@ -3863,7 +3635,6 @@
         </w:rPr>
         <w:t>udev</w:t>
       </w:r>
-      <w:proofErr w:type="spellEnd"/>
       <w:r>
         <w:rPr>
           <w:i/>
@@ -3903,25 +3674,7 @@
           <w:iCs/>
           <w:lang w:val="en-US"/>
         </w:rPr>
-        <w:t xml:space="preserve">auto-reset before </w:t>
-      </w:r>
-      <w:proofErr w:type="gramStart"/>
-      <w:r>
-        <w:rPr>
-          <w:i/>
-          <w:iCs/>
-          <w:lang w:val="en-US"/>
-        </w:rPr>
-        <w:t>upload</w:t>
-      </w:r>
-      <w:proofErr w:type="gramEnd"/>
-      <w:r>
-        <w:rPr>
-          <w:i/>
-          <w:iCs/>
-          <w:lang w:val="en-US"/>
-        </w:rPr>
-        <w:t>!</w:t>
+        <w:t>auto-reset before upload!</w:t>
       </w:r>
     </w:p>
     <w:p>
@@ -3935,7 +3688,6 @@
           <w:lang w:val="en-US"/>
         </w:rPr>
       </w:pPr>
-      <w:proofErr w:type="gramStart"/>
       <w:r>
         <w:rPr>
           <w:rFonts w:ascii="Courier New" w:hAnsi="Courier New" w:cs="Courier New"/>
@@ -3943,71 +3695,74 @@
           <w:szCs w:val="22"/>
           <w:lang w:val="en-US"/>
         </w:rPr>
-        <w:t>#!/</w:t>
-      </w:r>
-      <w:proofErr w:type="gramEnd"/>
-      <w:r>
+        <w:t>#!/bin/bash</w:t>
+      </w:r>
+    </w:p>
+    <w:p>
+      <w:pPr>
+        <w:shd w:val="clear" w:color="auto" w:fill="F2F2F2" w:themeFill="background1" w:themeFillShade="F2"/>
+        <w:jc w:val="left"/>
         <w:rPr>
           <w:rFonts w:ascii="Courier New" w:hAnsi="Courier New" w:cs="Courier New"/>
           <w:sz w:val="20"/>
           <w:szCs w:val="22"/>
           <w:lang w:val="en-US"/>
         </w:rPr>
-        <w:t>bin/bash</w:t>
-      </w:r>
-    </w:p>
-    <w:p>
-      <w:pPr>
-        <w:shd w:val="clear" w:color="auto" w:fill="F2F2F2" w:themeFill="background1" w:themeFillShade="F2"/>
-        <w:jc w:val="left"/>
+      </w:pPr>
+      <w:r>
         <w:rPr>
           <w:rFonts w:ascii="Courier New" w:hAnsi="Courier New" w:cs="Courier New"/>
           <w:sz w:val="20"/>
           <w:szCs w:val="22"/>
           <w:lang w:val="en-US"/>
         </w:rPr>
-      </w:pPr>
-      <w:r>
+        <w:t># K-Comp Board Rule Installer</w:t>
+      </w:r>
+    </w:p>
+    <w:p>
+      <w:pPr>
+        <w:shd w:val="clear" w:color="auto" w:fill="F2F2F2" w:themeFill="background1" w:themeFillShade="F2"/>
+        <w:jc w:val="left"/>
         <w:rPr>
           <w:rFonts w:ascii="Courier New" w:hAnsi="Courier New" w:cs="Courier New"/>
           <w:sz w:val="20"/>
           <w:szCs w:val="22"/>
           <w:lang w:val="en-US"/>
         </w:rPr>
-        <w:t># K-Comp Board Rule Installer</w:t>
-      </w:r>
-    </w:p>
-    <w:p>
-      <w:pPr>
-        <w:shd w:val="clear" w:color="auto" w:fill="F2F2F2" w:themeFill="background1" w:themeFillShade="F2"/>
-        <w:jc w:val="left"/>
+      </w:pPr>
+      <w:r>
         <w:rPr>
           <w:rFonts w:ascii="Courier New" w:hAnsi="Courier New" w:cs="Courier New"/>
           <w:sz w:val="20"/>
           <w:szCs w:val="22"/>
           <w:lang w:val="en-US"/>
         </w:rPr>
-      </w:pPr>
-      <w:r>
+        <w:t># Run this once with sudo: sudo ./install_linux_rules.sh</w:t>
+      </w:r>
+    </w:p>
+    <w:p>
+      <w:pPr>
+        <w:shd w:val="clear" w:color="auto" w:fill="F2F2F2" w:themeFill="background1" w:themeFillShade="F2"/>
+        <w:jc w:val="left"/>
         <w:rPr>
           <w:rFonts w:ascii="Courier New" w:hAnsi="Courier New" w:cs="Courier New"/>
           <w:sz w:val="20"/>
           <w:szCs w:val="22"/>
           <w:lang w:val="en-US"/>
         </w:rPr>
-        <w:t xml:space="preserve"># Run this once with </w:t>
-      </w:r>
-      <w:proofErr w:type="spellStart"/>
-      <w:r>
+      </w:pPr>
+    </w:p>
+    <w:p>
+      <w:pPr>
+        <w:shd w:val="clear" w:color="auto" w:fill="F2F2F2" w:themeFill="background1" w:themeFillShade="F2"/>
+        <w:jc w:val="left"/>
         <w:rPr>
           <w:rFonts w:ascii="Courier New" w:hAnsi="Courier New" w:cs="Courier New"/>
           <w:sz w:val="20"/>
           <w:szCs w:val="22"/>
           <w:lang w:val="en-US"/>
         </w:rPr>
-        <w:t>sudo</w:t>
-      </w:r>
-      <w:proofErr w:type="spellEnd"/>
+      </w:pPr>
       <w:r>
         <w:rPr>
           <w:rFonts w:ascii="Courier New" w:hAnsi="Courier New" w:cs="Courier New"/>
@@ -4015,40 +3770,41 @@
           <w:szCs w:val="22"/>
           <w:lang w:val="en-US"/>
         </w:rPr>
-        <w:t xml:space="preserve">: </w:t>
-      </w:r>
-      <w:proofErr w:type="spellStart"/>
-      <w:r>
+        <w:t>echo "Installing udev rules for K-Comp (MCP2221A)..."</w:t>
+      </w:r>
+    </w:p>
+    <w:p>
+      <w:pPr>
+        <w:shd w:val="clear" w:color="auto" w:fill="F2F2F2" w:themeFill="background1" w:themeFillShade="F2"/>
+        <w:jc w:val="left"/>
         <w:rPr>
           <w:rFonts w:ascii="Courier New" w:hAnsi="Courier New" w:cs="Courier New"/>
           <w:sz w:val="20"/>
           <w:szCs w:val="22"/>
           <w:lang w:val="en-US"/>
         </w:rPr>
-        <w:t>sudo</w:t>
-      </w:r>
-      <w:proofErr w:type="spellEnd"/>
-      <w:r>
+      </w:pPr>
+    </w:p>
+    <w:p>
+      <w:pPr>
+        <w:shd w:val="clear" w:color="auto" w:fill="F2F2F2" w:themeFill="background1" w:themeFillShade="F2"/>
+        <w:jc w:val="left"/>
         <w:rPr>
           <w:rFonts w:ascii="Courier New" w:hAnsi="Courier New" w:cs="Courier New"/>
           <w:sz w:val="20"/>
           <w:szCs w:val="22"/>
           <w:lang w:val="en-US"/>
         </w:rPr>
-        <w:t xml:space="preserve"> ./install_linux_rules.sh</w:t>
-      </w:r>
-    </w:p>
-    <w:p>
-      <w:pPr>
-        <w:shd w:val="clear" w:color="auto" w:fill="F2F2F2" w:themeFill="background1" w:themeFillShade="F2"/>
-        <w:jc w:val="left"/>
+      </w:pPr>
+      <w:r>
         <w:rPr>
           <w:rFonts w:ascii="Courier New" w:hAnsi="Courier New" w:cs="Courier New"/>
           <w:sz w:val="20"/>
           <w:szCs w:val="22"/>
           <w:lang w:val="en-US"/>
         </w:rPr>
-      </w:pPr>
+        <w:t># 1. Create the rule file</w:t>
+      </w:r>
     </w:p>
     <w:p>
       <w:pPr>
@@ -4068,29 +3824,32 @@
           <w:szCs w:val="22"/>
           <w:lang w:val="en-US"/>
         </w:rPr>
-        <w:t xml:space="preserve">echo "Installing </w:t>
-      </w:r>
-      <w:proofErr w:type="spellStart"/>
-      <w:r>
+        <w:t>echo 'SUBSYSTEM=="usb", ATTRS{idVendor}=="04d8", MODE="0666", GROUP="plugdev"' | sudo tee /etc/udev/rules.d/99-kcomp.rules &gt; /dev/null</w:t>
+      </w:r>
+    </w:p>
+    <w:p>
+      <w:pPr>
+        <w:shd w:val="clear" w:color="auto" w:fill="F2F2F2" w:themeFill="background1" w:themeFillShade="F2"/>
+        <w:jc w:val="left"/>
         <w:rPr>
           <w:rFonts w:ascii="Courier New" w:hAnsi="Courier New" w:cs="Courier New"/>
           <w:sz w:val="20"/>
           <w:szCs w:val="22"/>
           <w:lang w:val="en-US"/>
         </w:rPr>
-        <w:t>udev</w:t>
-      </w:r>
-      <w:proofErr w:type="spellEnd"/>
-      <w:r>
+      </w:pPr>
+    </w:p>
+    <w:p>
+      <w:pPr>
+        <w:shd w:val="clear" w:color="auto" w:fill="F2F2F2" w:themeFill="background1" w:themeFillShade="F2"/>
+        <w:jc w:val="left"/>
         <w:rPr>
           <w:rFonts w:ascii="Courier New" w:hAnsi="Courier New" w:cs="Courier New"/>
           <w:sz w:val="20"/>
           <w:szCs w:val="22"/>
           <w:lang w:val="en-US"/>
         </w:rPr>
-        <w:t xml:space="preserve"> rules for K-Comp (MCP2221</w:t>
-      </w:r>
-      <w:proofErr w:type="gramStart"/>
+      </w:pPr>
       <w:r>
         <w:rPr>
           <w:rFonts w:ascii="Courier New" w:hAnsi="Courier New" w:cs="Courier New"/>
@@ -4098,30 +3857,29 @@
           <w:szCs w:val="22"/>
           <w:lang w:val="en-US"/>
         </w:rPr>
-        <w:t>A)...</w:t>
-      </w:r>
-      <w:proofErr w:type="gramEnd"/>
-      <w:r>
+        <w:t># 2. Reload rules</w:t>
+      </w:r>
+    </w:p>
+    <w:p>
+      <w:pPr>
+        <w:shd w:val="clear" w:color="auto" w:fill="F2F2F2" w:themeFill="background1" w:themeFillShade="F2"/>
+        <w:jc w:val="left"/>
         <w:rPr>
           <w:rFonts w:ascii="Courier New" w:hAnsi="Courier New" w:cs="Courier New"/>
           <w:sz w:val="20"/>
           <w:szCs w:val="22"/>
           <w:lang w:val="en-US"/>
         </w:rPr>
-        <w:t>"</w:t>
-      </w:r>
-    </w:p>
-    <w:p>
-      <w:pPr>
-        <w:shd w:val="clear" w:color="auto" w:fill="F2F2F2" w:themeFill="background1" w:themeFillShade="F2"/>
-        <w:jc w:val="left"/>
+      </w:pPr>
+      <w:r>
         <w:rPr>
           <w:rFonts w:ascii="Courier New" w:hAnsi="Courier New" w:cs="Courier New"/>
           <w:sz w:val="20"/>
           <w:szCs w:val="22"/>
           <w:lang w:val="en-US"/>
         </w:rPr>
-      </w:pPr>
+        <w:t>sudo udevadm control --reload-rules</w:t>
+      </w:r>
     </w:p>
     <w:p>
       <w:pPr>
@@ -4141,7 +3899,7 @@
           <w:szCs w:val="22"/>
           <w:lang w:val="en-US"/>
         </w:rPr>
-        <w:t># 1. Create the rule file</w:t>
+        <w:t>sudo udevadm trigger</w:t>
       </w:r>
     </w:p>
     <w:p>
@@ -4155,16 +3913,18 @@
           <w:lang w:val="en-US"/>
         </w:rPr>
       </w:pPr>
-      <w:r>
+    </w:p>
+    <w:p>
+      <w:pPr>
+        <w:shd w:val="clear" w:color="auto" w:fill="F2F2F2" w:themeFill="background1" w:themeFillShade="F2"/>
+        <w:jc w:val="left"/>
         <w:rPr>
           <w:rFonts w:ascii="Courier New" w:hAnsi="Courier New" w:cs="Courier New"/>
           <w:sz w:val="20"/>
           <w:szCs w:val="22"/>
           <w:lang w:val="en-US"/>
         </w:rPr>
-        <w:t>echo 'SUBSYSTEM=="</w:t>
-      </w:r>
-      <w:proofErr w:type="spellStart"/>
+      </w:pPr>
       <w:r>
         <w:rPr>
           <w:rFonts w:ascii="Courier New" w:hAnsi="Courier New" w:cs="Courier New"/>
@@ -4172,358 +3932,7 @@
           <w:szCs w:val="22"/>
           <w:lang w:val="en-US"/>
         </w:rPr>
-        <w:t>usb</w:t>
-      </w:r>
-      <w:proofErr w:type="spellEnd"/>
-      <w:r>
-        <w:rPr>
-          <w:rFonts w:ascii="Courier New" w:hAnsi="Courier New" w:cs="Courier New"/>
-          <w:sz w:val="20"/>
-          <w:szCs w:val="22"/>
-          <w:lang w:val="en-US"/>
-        </w:rPr>
-        <w:t xml:space="preserve">", </w:t>
-      </w:r>
-      <w:proofErr w:type="gramStart"/>
-      <w:r>
-        <w:rPr>
-          <w:rFonts w:ascii="Courier New" w:hAnsi="Courier New" w:cs="Courier New"/>
-          <w:sz w:val="20"/>
-          <w:szCs w:val="22"/>
-          <w:lang w:val="en-US"/>
-        </w:rPr>
-        <w:t>ATTRS{</w:t>
-      </w:r>
-      <w:proofErr w:type="spellStart"/>
-      <w:proofErr w:type="gramEnd"/>
-      <w:r>
-        <w:rPr>
-          <w:rFonts w:ascii="Courier New" w:hAnsi="Courier New" w:cs="Courier New"/>
-          <w:sz w:val="20"/>
-          <w:szCs w:val="22"/>
-          <w:lang w:val="en-US"/>
-        </w:rPr>
-        <w:t>idVendor</w:t>
-      </w:r>
-      <w:proofErr w:type="spellEnd"/>
-      <w:r>
-        <w:rPr>
-          <w:rFonts w:ascii="Courier New" w:hAnsi="Courier New" w:cs="Courier New"/>
-          <w:sz w:val="20"/>
-          <w:szCs w:val="22"/>
-          <w:lang w:val="en-US"/>
-        </w:rPr>
-        <w:t>}=="04d8", MODE="0666", GROUP="</w:t>
-      </w:r>
-      <w:proofErr w:type="spellStart"/>
-      <w:r>
-        <w:rPr>
-          <w:rFonts w:ascii="Courier New" w:hAnsi="Courier New" w:cs="Courier New"/>
-          <w:sz w:val="20"/>
-          <w:szCs w:val="22"/>
-          <w:lang w:val="en-US"/>
-        </w:rPr>
-        <w:t>plugdev</w:t>
-      </w:r>
-      <w:proofErr w:type="spellEnd"/>
-      <w:r>
-        <w:rPr>
-          <w:rFonts w:ascii="Courier New" w:hAnsi="Courier New" w:cs="Courier New"/>
-          <w:sz w:val="20"/>
-          <w:szCs w:val="22"/>
-          <w:lang w:val="en-US"/>
-        </w:rPr>
-        <w:t xml:space="preserve">"' | </w:t>
-      </w:r>
-      <w:proofErr w:type="spellStart"/>
-      <w:r>
-        <w:rPr>
-          <w:rFonts w:ascii="Courier New" w:hAnsi="Courier New" w:cs="Courier New"/>
-          <w:sz w:val="20"/>
-          <w:szCs w:val="22"/>
-          <w:lang w:val="en-US"/>
-        </w:rPr>
-        <w:t>sudo</w:t>
-      </w:r>
-      <w:proofErr w:type="spellEnd"/>
-      <w:r>
-        <w:rPr>
-          <w:rFonts w:ascii="Courier New" w:hAnsi="Courier New" w:cs="Courier New"/>
-          <w:sz w:val="20"/>
-          <w:szCs w:val="22"/>
-          <w:lang w:val="en-US"/>
-        </w:rPr>
-        <w:t xml:space="preserve"> tee /</w:t>
-      </w:r>
-      <w:proofErr w:type="spellStart"/>
-      <w:r>
-        <w:rPr>
-          <w:rFonts w:ascii="Courier New" w:hAnsi="Courier New" w:cs="Courier New"/>
-          <w:sz w:val="20"/>
-          <w:szCs w:val="22"/>
-          <w:lang w:val="en-US"/>
-        </w:rPr>
-        <w:t>etc</w:t>
-      </w:r>
-      <w:proofErr w:type="spellEnd"/>
-      <w:r>
-        <w:rPr>
-          <w:rFonts w:ascii="Courier New" w:hAnsi="Courier New" w:cs="Courier New"/>
-          <w:sz w:val="20"/>
-          <w:szCs w:val="22"/>
-          <w:lang w:val="en-US"/>
-        </w:rPr>
-        <w:t>/</w:t>
-      </w:r>
-      <w:proofErr w:type="spellStart"/>
-      <w:r>
-        <w:rPr>
-          <w:rFonts w:ascii="Courier New" w:hAnsi="Courier New" w:cs="Courier New"/>
-          <w:sz w:val="20"/>
-          <w:szCs w:val="22"/>
-          <w:lang w:val="en-US"/>
-        </w:rPr>
-        <w:t>udev</w:t>
-      </w:r>
-      <w:proofErr w:type="spellEnd"/>
-      <w:r>
-        <w:rPr>
-          <w:rFonts w:ascii="Courier New" w:hAnsi="Courier New" w:cs="Courier New"/>
-          <w:sz w:val="20"/>
-          <w:szCs w:val="22"/>
-          <w:lang w:val="en-US"/>
-        </w:rPr>
-        <w:t>/</w:t>
-      </w:r>
-      <w:proofErr w:type="spellStart"/>
-      <w:r>
-        <w:rPr>
-          <w:rFonts w:ascii="Courier New" w:hAnsi="Courier New" w:cs="Courier New"/>
-          <w:sz w:val="20"/>
-          <w:szCs w:val="22"/>
-          <w:lang w:val="en-US"/>
-        </w:rPr>
-        <w:t>rules.d</w:t>
-      </w:r>
-      <w:proofErr w:type="spellEnd"/>
-      <w:r>
-        <w:rPr>
-          <w:rFonts w:ascii="Courier New" w:hAnsi="Courier New" w:cs="Courier New"/>
-          <w:sz w:val="20"/>
-          <w:szCs w:val="22"/>
-          <w:lang w:val="en-US"/>
-        </w:rPr>
-        <w:t>/99-kcomp.rules &gt; /dev/null</w:t>
-      </w:r>
-    </w:p>
-    <w:p>
-      <w:pPr>
-        <w:shd w:val="clear" w:color="auto" w:fill="F2F2F2" w:themeFill="background1" w:themeFillShade="F2"/>
-        <w:jc w:val="left"/>
-        <w:rPr>
-          <w:rFonts w:ascii="Courier New" w:hAnsi="Courier New" w:cs="Courier New"/>
-          <w:sz w:val="20"/>
-          <w:szCs w:val="22"/>
-          <w:lang w:val="en-US"/>
-        </w:rPr>
-      </w:pPr>
-    </w:p>
-    <w:p>
-      <w:pPr>
-        <w:shd w:val="clear" w:color="auto" w:fill="F2F2F2" w:themeFill="background1" w:themeFillShade="F2"/>
-        <w:jc w:val="left"/>
-        <w:rPr>
-          <w:rFonts w:ascii="Courier New" w:hAnsi="Courier New" w:cs="Courier New"/>
-          <w:sz w:val="20"/>
-          <w:szCs w:val="22"/>
-          <w:lang w:val="en-US"/>
-        </w:rPr>
-      </w:pPr>
-      <w:r>
-        <w:rPr>
-          <w:rFonts w:ascii="Courier New" w:hAnsi="Courier New" w:cs="Courier New"/>
-          <w:sz w:val="20"/>
-          <w:szCs w:val="22"/>
-          <w:lang w:val="en-US"/>
-        </w:rPr>
-        <w:t xml:space="preserve"># 2. </w:t>
-      </w:r>
-      <w:proofErr w:type="gramStart"/>
-      <w:r>
-        <w:rPr>
-          <w:rFonts w:ascii="Courier New" w:hAnsi="Courier New" w:cs="Courier New"/>
-          <w:sz w:val="20"/>
-          <w:szCs w:val="22"/>
-          <w:lang w:val="en-US"/>
-        </w:rPr>
-        <w:t>Reload</w:t>
-      </w:r>
-      <w:proofErr w:type="gramEnd"/>
-      <w:r>
-        <w:rPr>
-          <w:rFonts w:ascii="Courier New" w:hAnsi="Courier New" w:cs="Courier New"/>
-          <w:sz w:val="20"/>
-          <w:szCs w:val="22"/>
-          <w:lang w:val="en-US"/>
-        </w:rPr>
-        <w:t xml:space="preserve"> rules</w:t>
-      </w:r>
-    </w:p>
-    <w:p>
-      <w:pPr>
-        <w:shd w:val="clear" w:color="auto" w:fill="F2F2F2" w:themeFill="background1" w:themeFillShade="F2"/>
-        <w:jc w:val="left"/>
-        <w:rPr>
-          <w:rFonts w:ascii="Courier New" w:hAnsi="Courier New" w:cs="Courier New"/>
-          <w:sz w:val="20"/>
-          <w:szCs w:val="22"/>
-          <w:lang w:val="en-US"/>
-        </w:rPr>
-      </w:pPr>
-      <w:proofErr w:type="spellStart"/>
-      <w:r>
-        <w:rPr>
-          <w:rFonts w:ascii="Courier New" w:hAnsi="Courier New" w:cs="Courier New"/>
-          <w:sz w:val="20"/>
-          <w:szCs w:val="22"/>
-          <w:lang w:val="en-US"/>
-        </w:rPr>
-        <w:t>sudo</w:t>
-      </w:r>
-      <w:proofErr w:type="spellEnd"/>
-      <w:r>
-        <w:rPr>
-          <w:rFonts w:ascii="Courier New" w:hAnsi="Courier New" w:cs="Courier New"/>
-          <w:sz w:val="20"/>
-          <w:szCs w:val="22"/>
-          <w:lang w:val="en-US"/>
-        </w:rPr>
-        <w:t xml:space="preserve"> </w:t>
-      </w:r>
-      <w:proofErr w:type="spellStart"/>
-      <w:r>
-        <w:rPr>
-          <w:rFonts w:ascii="Courier New" w:hAnsi="Courier New" w:cs="Courier New"/>
-          <w:sz w:val="20"/>
-          <w:szCs w:val="22"/>
-          <w:lang w:val="en-US"/>
-        </w:rPr>
-        <w:t>udevadm</w:t>
-      </w:r>
-      <w:proofErr w:type="spellEnd"/>
-      <w:r>
-        <w:rPr>
-          <w:rFonts w:ascii="Courier New" w:hAnsi="Courier New" w:cs="Courier New"/>
-          <w:sz w:val="20"/>
-          <w:szCs w:val="22"/>
-          <w:lang w:val="en-US"/>
-        </w:rPr>
-        <w:t xml:space="preserve"> control --reload-rules</w:t>
-      </w:r>
-    </w:p>
-    <w:p>
-      <w:pPr>
-        <w:shd w:val="clear" w:color="auto" w:fill="F2F2F2" w:themeFill="background1" w:themeFillShade="F2"/>
-        <w:jc w:val="left"/>
-        <w:rPr>
-          <w:rFonts w:ascii="Courier New" w:hAnsi="Courier New" w:cs="Courier New"/>
-          <w:sz w:val="20"/>
-          <w:szCs w:val="22"/>
-          <w:lang w:val="en-US"/>
-        </w:rPr>
-      </w:pPr>
-      <w:proofErr w:type="spellStart"/>
-      <w:r>
-        <w:rPr>
-          <w:rFonts w:ascii="Courier New" w:hAnsi="Courier New" w:cs="Courier New"/>
-          <w:sz w:val="20"/>
-          <w:szCs w:val="22"/>
-          <w:lang w:val="en-US"/>
-        </w:rPr>
-        <w:t>sudo</w:t>
-      </w:r>
-      <w:proofErr w:type="spellEnd"/>
-      <w:r>
-        <w:rPr>
-          <w:rFonts w:ascii="Courier New" w:hAnsi="Courier New" w:cs="Courier New"/>
-          <w:sz w:val="20"/>
-          <w:szCs w:val="22"/>
-          <w:lang w:val="en-US"/>
-        </w:rPr>
-        <w:t xml:space="preserve"> </w:t>
-      </w:r>
-      <w:proofErr w:type="spellStart"/>
-      <w:r>
-        <w:rPr>
-          <w:rFonts w:ascii="Courier New" w:hAnsi="Courier New" w:cs="Courier New"/>
-          <w:sz w:val="20"/>
-          <w:szCs w:val="22"/>
-          <w:lang w:val="en-US"/>
-        </w:rPr>
-        <w:t>udevadm</w:t>
-      </w:r>
-      <w:proofErr w:type="spellEnd"/>
-      <w:r>
-        <w:rPr>
-          <w:rFonts w:ascii="Courier New" w:hAnsi="Courier New" w:cs="Courier New"/>
-          <w:sz w:val="20"/>
-          <w:szCs w:val="22"/>
-          <w:lang w:val="en-US"/>
-        </w:rPr>
-        <w:t xml:space="preserve"> trigger</w:t>
-      </w:r>
-    </w:p>
-    <w:p>
-      <w:pPr>
-        <w:shd w:val="clear" w:color="auto" w:fill="F2F2F2" w:themeFill="background1" w:themeFillShade="F2"/>
-        <w:jc w:val="left"/>
-        <w:rPr>
-          <w:rFonts w:ascii="Courier New" w:hAnsi="Courier New" w:cs="Courier New"/>
-          <w:sz w:val="20"/>
-          <w:szCs w:val="22"/>
-          <w:lang w:val="en-US"/>
-        </w:rPr>
-      </w:pPr>
-    </w:p>
-    <w:p>
-      <w:pPr>
-        <w:shd w:val="clear" w:color="auto" w:fill="F2F2F2" w:themeFill="background1" w:themeFillShade="F2"/>
-        <w:jc w:val="left"/>
-        <w:rPr>
-          <w:rFonts w:ascii="Courier New" w:hAnsi="Courier New" w:cs="Courier New"/>
-          <w:sz w:val="20"/>
-          <w:szCs w:val="22"/>
-          <w:lang w:val="en-US"/>
-        </w:rPr>
-      </w:pPr>
-      <w:r>
-        <w:rPr>
-          <w:rFonts w:ascii="Courier New" w:hAnsi="Courier New" w:cs="Courier New"/>
-          <w:sz w:val="20"/>
-          <w:szCs w:val="22"/>
-          <w:lang w:val="en-US"/>
-        </w:rPr>
-        <w:t xml:space="preserve">echo "Success! Please unplug and </w:t>
-      </w:r>
-      <w:proofErr w:type="spellStart"/>
-      <w:r>
-        <w:rPr>
-          <w:rFonts w:ascii="Courier New" w:hAnsi="Courier New" w:cs="Courier New"/>
-          <w:sz w:val="20"/>
-          <w:szCs w:val="22"/>
-          <w:lang w:val="en-US"/>
-        </w:rPr>
-        <w:t>replug</w:t>
-      </w:r>
-      <w:proofErr w:type="spellEnd"/>
-      <w:r>
-        <w:rPr>
-          <w:rFonts w:ascii="Courier New" w:hAnsi="Courier New" w:cs="Courier New"/>
-          <w:sz w:val="20"/>
-          <w:szCs w:val="22"/>
-          <w:lang w:val="en-US"/>
-        </w:rPr>
-        <w:t xml:space="preserve"> your K-Comp board."</w:t>
+        <w:t>echo "Success! Please unplug and replug your K-Comp board."</w:t>
       </w:r>
     </w:p>
     <w:p>
@@ -4694,7 +4103,6 @@
         </w:rPr>
         <w:t xml:space="preserve">Install the </w:t>
       </w:r>
-      <w:proofErr w:type="spellStart"/>
       <w:r>
         <w:rPr>
           <w:i/>
@@ -4703,18 +4111,7 @@
           <w:szCs w:val="32"/>
           <w:lang w:val="en-US"/>
         </w:rPr>
-        <w:t>PlatformIO</w:t>
-      </w:r>
-      <w:proofErr w:type="spellEnd"/>
-      <w:r>
-        <w:rPr>
-          <w:i/>
-          <w:kern w:val="32"/>
-          <w:sz w:val="24"/>
-          <w:szCs w:val="32"/>
-          <w:lang w:val="en-US"/>
-        </w:rPr>
-        <w:t xml:space="preserve"> Extension </w:t>
+        <w:t xml:space="preserve">PlatformIO Extension </w:t>
       </w:r>
       <w:r>
         <w:rPr>
@@ -4823,7 +4220,6 @@
         </w:rPr>
         <w:t xml:space="preserve">Open the </w:t>
       </w:r>
-      <w:proofErr w:type="spellStart"/>
       <w:r>
         <w:rPr>
           <w:i/>
@@ -4832,18 +4228,7 @@
           <w:szCs w:val="32"/>
           <w:lang w:val="en-US"/>
         </w:rPr>
-        <w:t>PlatformIO</w:t>
-      </w:r>
-      <w:proofErr w:type="spellEnd"/>
-      <w:r>
-        <w:rPr>
-          <w:i/>
-          <w:kern w:val="32"/>
-          <w:sz w:val="24"/>
-          <w:szCs w:val="32"/>
-          <w:lang w:val="en-US"/>
-        </w:rPr>
-        <w:t xml:space="preserve"> Extension</w:t>
+        <w:t>PlatformIO Extension</w:t>
       </w:r>
       <w:r>
         <w:rPr>
@@ -4881,37 +4266,16 @@
           <w:szCs w:val="32"/>
           <w:lang w:val="en-US"/>
         </w:rPr>
-        <w:t xml:space="preserve">Advanced </w:t>
-      </w:r>
-      <w:proofErr w:type="gramStart"/>
-      <w:r>
-        <w:rPr>
-          <w:rFonts w:ascii="Courier New" w:hAnsi="Courier New" w:cs="Courier New"/>
+        <w:t>Advanced Installation</w:t>
+      </w:r>
+      <w:r>
+        <w:rPr>
           <w:kern w:val="32"/>
           <w:sz w:val="24"/>
           <w:szCs w:val="32"/>
           <w:lang w:val="en-US"/>
         </w:rPr>
-        <w:t>Installation</w:t>
-      </w:r>
-      <w:r>
-        <w:rPr>
-          <w:kern w:val="32"/>
-          <w:sz w:val="24"/>
-          <w:szCs w:val="32"/>
-          <w:lang w:val="en-US"/>
-        </w:rPr>
-        <w:t xml:space="preserve"> .</w:t>
-      </w:r>
-      <w:proofErr w:type="gramEnd"/>
-      <w:r>
-        <w:rPr>
-          <w:kern w:val="32"/>
-          <w:sz w:val="24"/>
-          <w:szCs w:val="32"/>
-          <w:lang w:val="en-US"/>
-        </w:rPr>
-        <w:t xml:space="preserve"> </w:t>
+        <w:t xml:space="preserve"> . </w:t>
       </w:r>
       <w:r>
         <w:rPr>
@@ -5400,31 +4764,7 @@
           <w:szCs w:val="32"/>
           <w:lang w:val="en-US"/>
         </w:rPr>
-        <w:t xml:space="preserve">Using K-Comp in </w:t>
-      </w:r>
-      <w:proofErr w:type="spellStart"/>
-      <w:r>
-        <w:rPr>
-          <w:b/>
-          <w:bCs/>
-          <w:kern w:val="32"/>
-          <w:sz w:val="24"/>
-          <w:szCs w:val="32"/>
-          <w:lang w:val="en-US"/>
-        </w:rPr>
-        <w:t>Mblock</w:t>
-      </w:r>
-      <w:proofErr w:type="spellEnd"/>
-      <w:r>
-        <w:rPr>
-          <w:b/>
-          <w:bCs/>
-          <w:kern w:val="32"/>
-          <w:sz w:val="24"/>
-          <w:szCs w:val="32"/>
-          <w:lang w:val="en-US"/>
-        </w:rPr>
-        <w:t xml:space="preserve"> 5</w:t>
+        <w:t>Using K-Comp in Mblock 5</w:t>
       </w:r>
     </w:p>
     <w:p>
@@ -5450,7 +4790,6 @@
         </w:rPr>
         <w:t xml:space="preserve">Download and install </w:t>
       </w:r>
-      <w:proofErr w:type="spellStart"/>
       <w:r>
         <w:rPr>
           <w:i/>
@@ -5460,19 +4799,7 @@
           <w:szCs w:val="32"/>
           <w:lang w:val="en-US"/>
         </w:rPr>
-        <w:t>Mblock</w:t>
-      </w:r>
-      <w:proofErr w:type="spellEnd"/>
-      <w:r>
-        <w:rPr>
-          <w:i/>
-          <w:iCs/>
-          <w:kern w:val="32"/>
-          <w:sz w:val="24"/>
-          <w:szCs w:val="32"/>
-          <w:lang w:val="en-US"/>
-        </w:rPr>
-        <w:t xml:space="preserve"> 5</w:t>
+        <w:t>Mblock 5</w:t>
       </w:r>
       <w:r>
         <w:rPr>
@@ -5528,7 +4855,6 @@
         </w:rPr>
         <w:t xml:space="preserve">Run </w:t>
       </w:r>
-      <w:proofErr w:type="spellStart"/>
       <w:r>
         <w:rPr>
           <w:i/>
@@ -5538,19 +4864,7 @@
           <w:szCs w:val="32"/>
           <w:lang w:val="en-US"/>
         </w:rPr>
-        <w:t>Mblock</w:t>
-      </w:r>
-      <w:proofErr w:type="spellEnd"/>
-      <w:r>
-        <w:rPr>
-          <w:i/>
-          <w:iCs/>
-          <w:kern w:val="32"/>
-          <w:sz w:val="24"/>
-          <w:szCs w:val="32"/>
-          <w:lang w:val="en-US"/>
-        </w:rPr>
-        <w:t xml:space="preserve"> 5</w:t>
+        <w:t>Mblock 5</w:t>
       </w:r>
       <w:r>
         <w:rPr>
@@ -5648,20 +4962,8 @@
           <w:szCs w:val="32"/>
           <w:lang w:val="en-US"/>
         </w:rPr>
-        <w:t>k_comp_v</w:t>
-      </w:r>
-      <w:proofErr w:type="gramStart"/>
-      <w:r>
-        <w:rPr>
-          <w:rFonts w:ascii="Courier New" w:hAnsi="Courier New" w:cs="Courier New"/>
-          <w:kern w:val="32"/>
-          <w:sz w:val="24"/>
-          <w:szCs w:val="32"/>
-          <w:lang w:val="en-US"/>
-        </w:rPr>
-        <w:t>1.mext</w:t>
-      </w:r>
-      <w:proofErr w:type="gramEnd"/>
+        <w:t>k_comp_v1.mext</w:t>
+      </w:r>
       <w:r>
         <w:rPr>
           <w:kern w:val="32"/>
@@ -5679,23 +4981,19 @@
           <w:szCs w:val="32"/>
           <w:lang w:val="en-US"/>
         </w:rPr>
-        <w:t xml:space="preserve">K-Comp </w:t>
-      </w:r>
-      <w:proofErr w:type="spellStart"/>
-      <w:r>
-        <w:rPr>
-          <w:i/>
+        <w:t>K-Comp Mblock repository</w:t>
+      </w:r>
+      <w:r>
+        <w:rPr>
           <w:kern w:val="32"/>
           <w:sz w:val="24"/>
           <w:szCs w:val="32"/>
           <w:lang w:val="en-US"/>
         </w:rPr>
-        <w:t>Mblock</w:t>
-      </w:r>
-      <w:proofErr w:type="spellEnd"/>
-      <w:r>
-        <w:rPr>
-          <w:i/>
+        <w:t xml:space="preserve"> </w:t>
+      </w:r>
+      <w:r>
+        <w:rPr>
           <w:kern w:val="32"/>
           <w:sz w:val="24"/>
           <w:szCs w:val="32"/>
@@ -5703,70 +5001,27 @@
         </w:rPr>
         <w:t xml:space="preserve"> </w:t>
       </w:r>
-      <w:proofErr w:type="gramStart"/>
-      <w:r>
-        <w:rPr>
-          <w:i/>
+      <w:r>
+        <w:rPr>
           <w:kern w:val="32"/>
           <w:sz w:val="24"/>
           <w:szCs w:val="32"/>
           <w:lang w:val="en-US"/>
         </w:rPr>
-        <w:t>repository</w:t>
-      </w:r>
-      <w:r>
-        <w:rPr>
-          <w:kern w:val="32"/>
-          <w:sz w:val="24"/>
-          <w:szCs w:val="32"/>
-          <w:lang w:val="en-US"/>
-        </w:rPr>
-        <w:t xml:space="preserve"> </w:t>
-      </w:r>
-      <w:r>
-        <w:rPr>
-          <w:kern w:val="32"/>
-          <w:sz w:val="24"/>
-          <w:szCs w:val="32"/>
-          <w:lang w:val="en-US"/>
-        </w:rPr>
-        <w:t xml:space="preserve"> </w:t>
-      </w:r>
-      <w:r>
-        <w:rPr>
-          <w:kern w:val="32"/>
-          <w:sz w:val="24"/>
-          <w:szCs w:val="32"/>
-          <w:lang w:val="en-US"/>
-        </w:rPr>
         <w:t>(</w:t>
       </w:r>
-      <w:proofErr w:type="gramEnd"/>
-      <w:r>
-        <w:fldChar w:fldCharType="begin"/>
-      </w:r>
-      <w:r>
-        <w:rPr>
-          <w:lang w:val="en-US"/>
-        </w:rPr>
-        <w:instrText>HYPERLINK "https://github.com/andkuc/k-comp-mblock5"</w:instrText>
-      </w:r>
-      <w:r>
-        <w:fldChar w:fldCharType="separate"/>
-      </w:r>
-      <w:r>
-        <w:rPr>
-          <w:rStyle w:val="Hyperlink"/>
-          <w:kern w:val="32"/>
-          <w:sz w:val="24"/>
-          <w:szCs w:val="32"/>
-          <w:lang w:val="en-US"/>
-        </w:rPr>
-        <w:t>https://github.com/andkuc/k-comp-mblock5</w:t>
-      </w:r>
-      <w:r>
-        <w:fldChar w:fldCharType="end"/>
-      </w:r>
+      <w:hyperlink r:id="rId30" w:history="1">
+        <w:r>
+          <w:rPr>
+            <w:rStyle w:val="Hyperlink"/>
+            <w:kern w:val="32"/>
+            <w:sz w:val="24"/>
+            <w:szCs w:val="32"/>
+            <w:lang w:val="en-US"/>
+          </w:rPr>
+          <w:t>https://github.com/andkuc/k-comp-mblock5</w:t>
+        </w:r>
+      </w:hyperlink>
       <w:r>
         <w:rPr>
           <w:kern w:val="32"/>
@@ -5808,30 +5063,17 @@
           <w:szCs w:val="32"/>
           <w:lang w:val="en-US"/>
         </w:rPr>
-        <w:t>k_comp_v</w:t>
-      </w:r>
-      <w:proofErr w:type="gramStart"/>
-      <w:r>
-        <w:rPr>
-          <w:rFonts w:ascii="Courier New" w:hAnsi="Courier New" w:cs="Courier New"/>
+        <w:t>k_comp_v1.mext</w:t>
+      </w:r>
+      <w:r>
+        <w:rPr>
           <w:kern w:val="32"/>
           <w:sz w:val="24"/>
           <w:szCs w:val="32"/>
           <w:lang w:val="en-US"/>
         </w:rPr>
-        <w:t>1.mext</w:t>
-      </w:r>
-      <w:proofErr w:type="gramEnd"/>
-      <w:r>
-        <w:rPr>
-          <w:kern w:val="32"/>
-          <w:sz w:val="24"/>
-          <w:szCs w:val="32"/>
-          <w:lang w:val="en-US"/>
-        </w:rPr>
         <w:t xml:space="preserve"> into the </w:t>
       </w:r>
-      <w:proofErr w:type="spellStart"/>
       <w:r>
         <w:rPr>
           <w:i/>
@@ -5840,18 +5082,7 @@
           <w:szCs w:val="32"/>
           <w:lang w:val="en-US"/>
         </w:rPr>
-        <w:t>Mblock</w:t>
-      </w:r>
-      <w:proofErr w:type="spellEnd"/>
-      <w:r>
-        <w:rPr>
-          <w:i/>
-          <w:kern w:val="32"/>
-          <w:sz w:val="24"/>
-          <w:szCs w:val="32"/>
-          <w:lang w:val="en-US"/>
-        </w:rPr>
-        <w:t xml:space="preserve"> 5 IDE</w:t>
+        <w:t>Mblock 5 IDE</w:t>
       </w:r>
       <w:r>
         <w:rPr>
@@ -5899,7 +5130,7 @@
                     <pic:cNvPicPr/>
                   </pic:nvPicPr>
                   <pic:blipFill>
-                    <a:blip r:embed="rId30"/>
+                    <a:blip r:embed="rId31"/>
                     <a:stretch>
                       <a:fillRect/>
                     </a:stretch>
@@ -5963,7 +5194,6 @@
         </w:rPr>
         <w:t xml:space="preserve">. Make sure you have </w:t>
       </w:r>
-      <w:proofErr w:type="spellStart"/>
       <w:r>
         <w:rPr>
           <w:rFonts w:ascii="Courier New" w:hAnsi="Courier New" w:cs="Courier New"/>
@@ -5972,18 +5202,7 @@
           <w:szCs w:val="32"/>
           <w:lang w:val="en-US"/>
         </w:rPr>
-        <w:t>Show</w:t>
-      </w:r>
-      <w:proofErr w:type="spellEnd"/>
-      <w:r>
-        <w:rPr>
-          <w:rFonts w:ascii="Courier New" w:hAnsi="Courier New" w:cs="Courier New"/>
-          <w:kern w:val="32"/>
-          <w:sz w:val="24"/>
-          <w:szCs w:val="32"/>
-          <w:lang w:val="en-US"/>
-        </w:rPr>
-        <w:t xml:space="preserve"> all connectable devices</w:t>
+        <w:t>Show all connectable devices</w:t>
       </w:r>
       <w:r>
         <w:rPr>
@@ -6028,7 +5247,7 @@
                     <pic:cNvPicPr/>
                   </pic:nvPicPr>
                   <pic:blipFill>
-                    <a:blip r:embed="rId31" cstate="print">
+                    <a:blip r:embed="rId32" cstate="print">
                       <a:extLst>
                         <a:ext uri="{28A0092B-C50C-407E-A947-70E740481C1C}">
                           <a14:useLocalDpi xmlns:a14="http://schemas.microsoft.com/office/drawing/2010/main" val="0"/>
@@ -6130,10 +5349,10 @@
                     <pic:cNvPicPr/>
                   </pic:nvPicPr>
                   <pic:blipFill>
-                    <a:blip r:embed="rId32">
+                    <a:blip r:embed="rId33">
                       <a:extLst>
                         <a:ext uri="{96DAC541-7B7A-43D3-8B79-37D633B846F1}">
-                          <asvg:svgBlip xmlns:asvg="http://schemas.microsoft.com/office/drawing/2016/SVG/main" r:embed="rId33"/>
+                          <asvg:svgBlip xmlns:asvg="http://schemas.microsoft.com/office/drawing/2016/SVG/main" r:embed="rId34"/>
                         </a:ext>
                       </a:extLst>
                     </a:blip>
@@ -6187,10 +5406,10 @@
                     <pic:cNvPicPr/>
                   </pic:nvPicPr>
                   <pic:blipFill>
-                    <a:blip r:embed="rId34">
+                    <a:blip r:embed="rId35">
                       <a:extLst>
                         <a:ext uri="{96DAC541-7B7A-43D3-8B79-37D633B846F1}">
-                          <asvg:svgBlip xmlns:asvg="http://schemas.microsoft.com/office/drawing/2016/SVG/main" r:embed="rId35"/>
+                          <asvg:svgBlip xmlns:asvg="http://schemas.microsoft.com/office/drawing/2016/SVG/main" r:embed="rId36"/>
                         </a:ext>
                       </a:extLst>
                     </a:blip>
@@ -13864,25 +13083,16 @@
 </file>
 
 <file path=customXml/item1.xml><?xml version="1.0" encoding="utf-8"?>
-<b:Sources xmlns:b="http://schemas.openxmlformats.org/officeDocument/2006/bibliography" xmlns="http://schemas.openxmlformats.org/officeDocument/2006/bibliography" SelectedStyle="\APA.XSL" StyleName="APA"/>
-</file>
-
-<file path=customXml/item2.xml><?xml version="1.0" encoding="utf-8"?>
 <p:properties xmlns:p="http://schemas.microsoft.com/office/2006/metadata/properties" xmlns:xsi="http://www.w3.org/2001/XMLSchema-instance" xmlns:pc="http://schemas.microsoft.com/office/infopath/2007/PartnerControls">
   <documentManagement/>
 </p:properties>
 </file>
 
-<file path=customXml/item3.xml><?xml version="1.0" encoding="utf-8"?>
-<?mso-contentType ?>
-<FormTemplates xmlns="http://schemas.microsoft.com/sharepoint/v3/contenttype/forms">
-  <Display>DocumentLibraryForm</Display>
-  <Edit>DocumentLibraryForm</Edit>
-  <New>DocumentLibraryForm</New>
-</FormTemplates>
+<file path=customXml/item2.xml><?xml version="1.0" encoding="utf-8"?>
+<b:Sources xmlns:b="http://schemas.openxmlformats.org/officeDocument/2006/bibliography" xmlns="http://schemas.openxmlformats.org/officeDocument/2006/bibliography" SelectedStyle="\APA.XSL" StyleName="APA"/>
 </file>
 
-<file path=customXml/item4.xml><?xml version="1.0" encoding="utf-8"?>
+<file path=customXml/item3.xml><?xml version="1.0" encoding="utf-8"?>
 <ct:contentTypeSchema xmlns:ct="http://schemas.microsoft.com/office/2006/metadata/contentType" xmlns:ma="http://schemas.microsoft.com/office/2006/metadata/properties/metaAttributes" ct:_="" ma:_="" ma:contentTypeName="Document" ma:contentTypeID="0x010100CC67A076857BD748A8A042E9B7E77B8E" ma:contentTypeVersion="6" ma:contentTypeDescription="Create a new document." ma:contentTypeScope="" ma:versionID="0b038bfab33303ebbc2f2b22558ecf92">
   <xsd:schema xmlns:xsd="http://www.w3.org/2001/XMLSchema" xmlns:xs="http://www.w3.org/2001/XMLSchema" xmlns:p="http://schemas.microsoft.com/office/2006/metadata/properties" xmlns:ns2="f5455410-5ba3-458d-a7a9-3c77617b6c40" targetNamespace="http://schemas.microsoft.com/office/2006/metadata/properties" ma:root="true" ma:fieldsID="2cf13b0c460200ec71f702e8e589f1d5" ns2:_="">
     <xsd:import namespace="f5455410-5ba3-458d-a7a9-3c77617b6c40"/>
@@ -14040,15 +13250,16 @@
 </ct:contentTypeSchema>
 </file>
 
-<file path=customXml/itemProps1.xml><?xml version="1.0" encoding="utf-8"?>
-<ds:datastoreItem xmlns:ds="http://schemas.openxmlformats.org/officeDocument/2006/customXml" ds:itemID="{8B2D935C-A548-491C-8787-DD38F81926BC}">
-  <ds:schemaRefs>
-    <ds:schemaRef ds:uri="http://schemas.openxmlformats.org/officeDocument/2006/bibliography"/>
-  </ds:schemaRefs>
-</ds:datastoreItem>
+<file path=customXml/item4.xml><?xml version="1.0" encoding="utf-8"?>
+<?mso-contentType ?>
+<FormTemplates xmlns="http://schemas.microsoft.com/sharepoint/v3/contenttype/forms">
+  <Display>DocumentLibraryForm</Display>
+  <Edit>DocumentLibraryForm</Edit>
+  <New>DocumentLibraryForm</New>
+</FormTemplates>
 </file>
 
-<file path=customXml/itemProps2.xml><?xml version="1.0" encoding="utf-8"?>
+<file path=customXml/itemProps1.xml><?xml version="1.0" encoding="utf-8"?>
 <ds:datastoreItem xmlns:ds="http://schemas.openxmlformats.org/officeDocument/2006/customXml" ds:itemID="{11F604CB-3BDF-4AD9-B8E6-BBB3E7312EC7}">
   <ds:schemaRefs>
     <ds:schemaRef ds:uri="http://schemas.microsoft.com/office/2006/metadata/properties"/>
@@ -14057,15 +13268,15 @@
 </ds:datastoreItem>
 </file>
 
-<file path=customXml/itemProps3.xml><?xml version="1.0" encoding="utf-8"?>
-<ds:datastoreItem xmlns:ds="http://schemas.openxmlformats.org/officeDocument/2006/customXml" ds:itemID="{23B61768-69B7-46C9-844C-ECBBF0CB3A5F}">
+<file path=customXml/itemProps2.xml><?xml version="1.0" encoding="utf-8"?>
+<ds:datastoreItem xmlns:ds="http://schemas.openxmlformats.org/officeDocument/2006/customXml" ds:itemID="{8B2D935C-A548-491C-8787-DD38F81926BC}">
   <ds:schemaRefs>
-    <ds:schemaRef ds:uri="http://schemas.microsoft.com/sharepoint/v3/contenttype/forms"/>
+    <ds:schemaRef ds:uri="http://schemas.openxmlformats.org/officeDocument/2006/bibliography"/>
   </ds:schemaRefs>
 </ds:datastoreItem>
 </file>
 
-<file path=customXml/itemProps4.xml><?xml version="1.0" encoding="utf-8"?>
+<file path=customXml/itemProps3.xml><?xml version="1.0" encoding="utf-8"?>
 <ds:datastoreItem xmlns:ds="http://schemas.openxmlformats.org/officeDocument/2006/customXml" ds:itemID="{A8F19348-1194-4B7B-BF3F-1ED808171784}">
   <ds:schemaRefs>
     <ds:schemaRef ds:uri="http://schemas.microsoft.com/office/2006/metadata/contentType"/>
@@ -14081,4 +13292,12 @@
     <ds:schemaRef ds:uri="http://schemas.microsoft.com/internal/obd"/>
   </ds:schemaRefs>
 </ds:datastoreItem>
+</file>
+
+<file path=customXml/itemProps4.xml><?xml version="1.0" encoding="utf-8"?>
+<ds:datastoreItem xmlns:ds="http://schemas.openxmlformats.org/officeDocument/2006/customXml" ds:itemID="{23B61768-69B7-46C9-844C-ECBBF0CB3A5F}">
+  <ds:schemaRefs>
+    <ds:schemaRef ds:uri="http://schemas.microsoft.com/sharepoint/v3/contenttype/forms"/>
+  </ds:schemaRefs>
+</ds:datastoreItem>
 </file>
</xml_diff>